<commit_message>
docs: generalise tech stack and remove low-level config details
- Tech stack table now uses language-level names (Python, TypeScript)
  with generic framework descriptions rather than specific library names
- Removed specific port references, CLI flags, and implementation
  details not appropriate for an architecture document
- Deployment mode tables use generic component descriptions
- Folder structure simplified to top-level areas with intent comments
- Extension guide, roadmap, security, and next-steps sections updated
  to match the same level of abstraction

Co-Authored-By: Claude Sonnet 4.6 <noreply@anthropic.com>
</commit_message>
<xml_diff>
--- a/AI_Workbench_Architecture.docx
+++ b/AI_Workbench_Architecture.docx
@@ -134,7 +134,7 @@
     </w:p>
     <w:p>
       <w:r>
-        <w:t xml:space="preserve">The AI Workbench is a modular, extensible platform for AI-powered workflows. It runs as both a web application (React SPA served via FastAPI) and a desktop application (Electron + React) from a single shared backend and frontend codebase. All AI capabilities — Agentic AI, Skills, MCP Server integrations, RAG, and Memory — are available in both deployment modes.</w:t>
+        <w:t xml:space="preserve">The AI Workbench is a modular, extensible platform for AI-powered workflows. It runs as both a web application and a desktop application from a single shared backend and frontend codebase. All AI capabilities — Agentic AI, Skills, MCP Server integrations, RAG, and Memory — are available in both deployment modes.</w:t>
       </w:r>
     </w:p>
     <w:p>
@@ -144,7 +144,7 @@
     </w:p>
     <w:p>
       <w:r>
-        <w:t xml:space="preserve">MongoDB stores all RAG chunks, memory, skill configurations, agent logs, and user data. The platform is designed to be plug-and-play: adding a new skill, MCP server, LLM provider, or knowledge base requires only a configuration file change.</w:t>
+        <w:t xml:space="preserve">MongoDB stores all RAG chunks, memory, skill configurations, agent logs, and user data. The platform is designed to be plug-and-play: adding a new skill, MCP server, LLM provider, or knowledge base requires only a configuration change.</w:t>
       </w:r>
     </w:p>
     <w:p>
@@ -425,7 +425,7 @@
           </w:tcPr>
           <w:p>
             <w:r>
-              <w:t xml:space="preserve">A single FastAPI server powers both the web SPA and the Electron frontend. No duplicate logic.</w:t>
+              <w:t xml:space="preserve">A single backend service powers both the web and desktop clients. No duplicate logic.</w:t>
             </w:r>
           </w:p>
         </w:tc>
@@ -521,7 +521,7 @@
           </w:tcPr>
           <w:p>
             <w:r>
-              <w:t xml:space="preserve">All LLM calls go through LiteLLM so any provider can be swapped with a config change.</w:t>
+              <w:t xml:space="preserve">The LLM layer is abstracted so any provider can be swapped with a configuration change.</w:t>
             </w:r>
           </w:p>
         </w:tc>
@@ -747,7 +747,7 @@
           </w:tcPr>
           <w:p>
             <w:r>
-              <w:t xml:space="preserve">Python 3.11+ / FastAPI</w:t>
+              <w:t xml:space="preserve">Python</w:t>
             </w:r>
           </w:p>
         </w:tc>
@@ -770,7 +770,7 @@
           </w:tcPr>
           <w:p>
             <w:r>
-              <w:t xml:space="preserve">Async; best ecosystem for AI/ML; serves both web and desktop clients.</w:t>
+              <w:t xml:space="preserve">Best ecosystem for AI/ML workloads; async-capable; serves both web and desktop clients.</w:t>
             </w:r>
           </w:p>
         </w:tc>
@@ -818,7 +818,7 @@
           </w:tcPr>
           <w:p>
             <w:r>
-              <w:t xml:space="preserve">React (TypeScript) SPA</w:t>
+              <w:t xml:space="preserve">TypeScript / React</w:t>
             </w:r>
           </w:p>
         </w:tc>
@@ -841,7 +841,7 @@
           </w:tcPr>
           <w:p>
             <w:r>
-              <w:t xml:space="preserve">Served by FastAPI static files or CDN; same React codebase as Electron.</w:t>
+              <w:t xml:space="preserve">Strongly typed; component-based UI; shared codebase with the desktop app.</w:t>
             </w:r>
           </w:p>
         </w:tc>
@@ -912,7 +912,7 @@
           </w:tcPr>
           <w:p>
             <w:r>
-              <w:t xml:space="preserve">Wraps the React SPA in a native window; adds file system, OS tray, and shell access.</w:t>
+              <w:t xml:space="preserve">Cross-platform native window; adds local file system, OS tray, and shell access.</w:t>
             </w:r>
           </w:p>
         </w:tc>
@@ -960,7 +960,7 @@
           </w:tcPr>
           <w:p>
             <w:r>
-              <w:t xml:space="preserve">LiteLLM</w:t>
+              <w:t xml:space="preserve">LLM Gateway (e.g. LiteLLM)</w:t>
             </w:r>
           </w:p>
         </w:tc>
@@ -983,7 +983,7 @@
           </w:tcPr>
           <w:p>
             <w:r>
-              <w:t xml:space="preserve">Single API for 100+ providers: Claude, GPT-4, Gemini, Ollama, and more.</w:t>
+              <w:t xml:space="preserve">Single abstraction layer supporting multiple providers; swap models with a config change.</w:t>
             </w:r>
           </w:p>
         </w:tc>
@@ -1054,7 +1054,7 @@
           </w:tcPr>
           <w:p>
             <w:r>
-              <w:t xml:space="preserve">Full control; plug-and-play agent strategies (ReAct, Plan-and-Execute).</w:t>
+              <w:t xml:space="preserve">Full control over execution strategy; plug-and-play agent types.</w:t>
             </w:r>
           </w:p>
         </w:tc>
@@ -1102,7 +1102,7 @@
           </w:tcPr>
           <w:p>
             <w:r>
-              <w:t xml:space="preserve">LlamaIndex + MongoDB Atlas Vector Search</w:t>
+              <w:t xml:space="preserve">RAG Framework (e.g. LlamaIndex)</w:t>
             </w:r>
           </w:p>
         </w:tc>
@@ -1125,7 +1125,7 @@
           </w:tcPr>
           <w:p>
             <w:r>
-              <w:t xml:space="preserve">Mature retrieval; no separate vector DB required.</w:t>
+              <w:t xml:space="preserve">Handles document ingestion, chunking, embedding, and retrieval.</w:t>
             </w:r>
           </w:p>
         </w:tc>
@@ -1150,7 +1150,7 @@
           </w:tcPr>
           <w:p>
             <w:r>
-              <w:t xml:space="preserve">Memory store</w:t>
+              <w:t xml:space="preserve">Vector + document store</w:t>
             </w:r>
           </w:p>
         </w:tc>
@@ -1173,7 +1173,7 @@
           </w:tcPr>
           <w:p>
             <w:r>
-              <w:t xml:space="preserve">MongoDB (motor async driver)</w:t>
+              <w:t xml:space="preserve">MongoDB</w:t>
             </w:r>
           </w:p>
         </w:tc>
@@ -1196,7 +1196,7 @@
           </w:tcPr>
           <w:p>
             <w:r>
-              <w:t xml:space="preserve">Unified store for memory, RAG, configs, and logs.</w:t>
+              <w:t xml:space="preserve">Unified store for vector embeddings, memory, skill configs, and logs; no separate vector DB required.</w:t>
             </w:r>
           </w:p>
         </w:tc>
@@ -1244,7 +1244,7 @@
           </w:tcPr>
           <w:p>
             <w:r>
-              <w:t xml:space="preserve">anthropic-mcp-sdk</w:t>
+              <w:t xml:space="preserve">MCP SDK</w:t>
             </w:r>
           </w:p>
         </w:tc>
@@ -1267,7 +1267,7 @@
           </w:tcPr>
           <w:p>
             <w:r>
-              <w:t xml:space="preserve">Standard protocol for external tool servers.</w:t>
+              <w:t xml:space="preserve">Standard protocol for connecting external tool servers.</w:t>
             </w:r>
           </w:p>
         </w:tc>
@@ -1315,7 +1315,7 @@
           </w:tcPr>
           <w:p>
             <w:r>
-              <w:t xml:space="preserve">WebSocket (FastAPI + React)</w:t>
+              <w:t xml:space="preserve">WebSocket</w:t>
             </w:r>
           </w:p>
         </w:tc>
@@ -1386,7 +1386,7 @@
           </w:tcPr>
           <w:p>
             <w:r>
-              <w:t xml:space="preserve">Celery + Redis (optional)</w:t>
+              <w:t xml:space="preserve">Message Queue (e.g. Redis / Celery)</w:t>
             </w:r>
           </w:p>
         </w:tc>
@@ -1409,7 +1409,7 @@
           </w:tcPr>
           <w:p>
             <w:r>
-              <w:t xml:space="preserve">Background agent runs, scheduled tasks.</w:t>
+              <w:t xml:space="preserve">Optional; supports background agent runs and scheduled tasks.</w:t>
             </w:r>
           </w:p>
         </w:tc>
@@ -1457,7 +1457,7 @@
           </w:tcPr>
           <w:p>
             <w:r>
-              <w:t xml:space="preserve">PyInstaller + electron-builder</w:t>
+              <w:t xml:space="preserve">Desktop bundler</w:t>
             </w:r>
           </w:p>
         </w:tc>
@@ -1480,7 +1480,7 @@
           </w:tcPr>
           <w:p>
             <w:r>
-              <w:t xml:space="preserve">Single installer for Mac, Windows, Linux.</w:t>
+              <w:t xml:space="preserve">Single cross-platform installer (Mac, Windows, Linux).</w:t>
             </w:r>
           </w:p>
         </w:tc>
@@ -1528,7 +1528,7 @@
           </w:tcPr>
           <w:p>
             <w:r>
-              <w:t xml:space="preserve">Docker + Nginx / Cloud Run</w:t>
+              <w:t xml:space="preserve">Container (Docker)</w:t>
             </w:r>
           </w:p>
         </w:tc>
@@ -1551,7 +1551,7 @@
           </w:tcPr>
           <w:p>
             <w:r>
-              <w:t xml:space="preserve">Containerised deployment behind a reverse proxy.</w:t>
+              <w:t xml:space="preserve">Containerised deployment behind a reverse proxy or cloud service.</w:t>
             </w:r>
           </w:p>
         </w:tc>
@@ -1596,7 +1596,7 @@
     </w:p>
     <w:p>
       <w:r>
-        <w:t xml:space="preserve">The React SPA is served as static files. The FastAPI backend is deployed as a containerised service (Docker). Both communicate over HTTPS REST and secure WebSocket. Users access the app from any browser with no installation required.</w:t>
+        <w:t xml:space="preserve">The frontend is served as a web application. The backend is deployed as a containerised service. Both communicate over secure REST and WebSocket connections. Users access the app from any browser with no installation required.</w:t>
       </w:r>
     </w:p>
     <w:p>
@@ -1721,7 +1721,7 @@
           </w:tcPr>
           <w:p>
             <w:r>
-              <w:t xml:space="preserve">React SPA — served from CDN or FastAPI static mount</w:t>
+              <w:t xml:space="preserve">React SPA — served via CDN or web server</w:t>
             </w:r>
           </w:p>
         </w:tc>
@@ -1769,7 +1769,7 @@
           </w:tcPr>
           <w:p>
             <w:r>
-              <w:t xml:space="preserve">FastAPI container (Docker) — Cloud Run, ECS, or self-hosted VM</w:t>
+              <w:t xml:space="preserve">Python API server — containerised, cloud or self-hosted</w:t>
             </w:r>
           </w:p>
         </w:tc>
@@ -1817,7 +1817,7 @@
           </w:tcPr>
           <w:p>
             <w:r>
-              <w:t xml:space="preserve">MongoDB Atlas (cloud) or self-hosted MongoDB</w:t>
+              <w:t xml:space="preserve">MongoDB — cloud-managed or self-hosted</w:t>
             </w:r>
           </w:p>
         </w:tc>
@@ -1865,7 +1865,7 @@
           </w:tcPr>
           <w:p>
             <w:r>
-              <w:t xml:space="preserve">OAuth 2.0 / JWT tokens</w:t>
+              <w:t xml:space="preserve">Token-based authentication (e.g. OAuth 2.0)</w:t>
             </w:r>
           </w:p>
         </w:tc>
@@ -1913,7 +1913,7 @@
           </w:tcPr>
           <w:p>
             <w:r>
-              <w:t xml:space="preserve">HTTPS REST + WSS WebSocket</w:t>
+              <w:t xml:space="preserve">Secure REST API + WebSocket for streaming</w:t>
             </w:r>
           </w:p>
         </w:tc>
@@ -1985,7 +1985,7 @@
     </w:p>
     <w:p>
       <w:r>
-        <w:t xml:space="preserve">The same React frontend is bundled inside an Electron shell. The FastAPI backend runs as a local process spawned by Electron on startup (PyInstaller bundle). Communication is over localhost, so no external network is required for core features.</w:t>
+        <w:t xml:space="preserve">The same frontend is bundled inside a desktop shell (Electron). The backend runs as a local process started on application launch. All core features work offline with no external network dependency.</w:t>
       </w:r>
     </w:p>
     <w:p>
@@ -2110,7 +2110,7 @@
           </w:tcPr>
           <w:p>
             <w:r>
-              <w:t xml:space="preserve">Same React SPA, embedded in Electron BrowserWindow</w:t>
+              <w:t xml:space="preserve">Same web frontend, embedded in the desktop shell</w:t>
             </w:r>
           </w:p>
         </w:tc>
@@ -2158,7 +2158,7 @@
           </w:tcPr>
           <w:p>
             <w:r>
-              <w:t xml:space="preserve">FastAPI process spawned by Electron main process (localhost:8000)</w:t>
+              <w:t xml:space="preserve">Python API server running locally, started by the desktop shell</w:t>
             </w:r>
           </w:p>
         </w:tc>
@@ -2206,7 +2206,7 @@
           </w:tcPr>
           <w:p>
             <w:r>
-              <w:t xml:space="preserve">Local MongoDB or MongoDB Atlas (configurable)</w:t>
+              <w:t xml:space="preserve">Local MongoDB or cloud MongoDB (user-configurable)</w:t>
             </w:r>
           </w:p>
         </w:tc>
@@ -2254,7 +2254,7 @@
           </w:tcPr>
           <w:p>
             <w:r>
-              <w:t xml:space="preserve">Local session token or SSO (optional)</w:t>
+              <w:t xml:space="preserve">Local session or SSO (optional)</w:t>
             </w:r>
           </w:p>
         </w:tc>
@@ -2302,7 +2302,7 @@
           </w:tcPr>
           <w:p>
             <w:r>
-              <w:t xml:space="preserve">HTTP localhost REST + WS localhost WebSocket</w:t>
+              <w:t xml:space="preserve">Local REST API + WebSocket (loopback only)</w:t>
             </w:r>
           </w:p>
         </w:tc>
@@ -2350,7 +2350,7 @@
           </w:tcPr>
           <w:p>
             <w:r>
-              <w:t xml:space="preserve">Full local file system via Electron IPC + Node.js fs</w:t>
+              <w:t xml:space="preserve">Full local file system access via desktop shell IPC</w:t>
             </w:r>
           </w:p>
         </w:tc>
@@ -2429,7 +2429,7 @@
         </w:numPr>
       </w:pPr>
       <w:r>
-        <w:t xml:space="preserve">One React codebase. Feature flags (VITE_MODE=web | desktop) enable/disable desktop-only UI (tray settings, local file browser).</w:t>
+        <w:t xml:space="preserve">One frontend codebase shared by both web and desktop. Feature flags toggle desktop-only UI elements (local file browser, tray settings).</w:t>
       </w:r>
     </w:p>
     <w:p>
@@ -2441,7 +2441,7 @@
         </w:numPr>
       </w:pPr>
       <w:r>
-        <w:t xml:space="preserve">Electron injects a window.electronAPI bridge for IPC. Web builds provide a no-op stub so shared components compile in both modes.</w:t>
+        <w:t xml:space="preserve">A thin IPC bridge exposes desktop capabilities to the frontend. Web builds use a no-op stub so shared components work in both modes.</w:t>
       </w:r>
     </w:p>
     <w:p>
@@ -2453,7 +2453,7 @@
         </w:numPr>
       </w:pPr>
       <w:r>
-        <w:t xml:space="preserve">The FastAPI backend is identical in both deployments. Web users connect over the network; desktop users connect over localhost.</w:t>
+        <w:t xml:space="preserve">The backend is identical in both deployments. Web users connect over the network; desktop users connect over loopback.</w:t>
       </w:r>
     </w:p>
     <w:p>
@@ -2495,7 +2495,7 @@
     </w:p>
     <w:p>
       <w:r>
-        <w:t xml:space="preserve">The diagram below shows all five layers of the platform and how data flows between them. Both the Web App and Desktop App connect to the same FastAPI backend, which routes requests through the Orchestration Engine before reading from MongoDB and calling external integrations.</w:t>
+        <w:t xml:space="preserve">The diagram below shows all five layers of the platform and how data flows between them. Both the Web App and Desktop App connect to the same backend, which routes requests through the Orchestration Engine before reading from MongoDB and calling external integrations.</w:t>
       </w:r>
     </w:p>
     <w:p>
@@ -2681,7 +2681,7 @@
           </w:tcPr>
           <w:p>
             <w:r>
-              <w:t xml:space="preserve">Web: React SPA in browser. Desktop: React SPA in Electron window.</w:t>
+              <w:t xml:space="preserve">Web: browser-based frontend. Desktop: same frontend inside a native desktop shell.</w:t>
             </w:r>
           </w:p>
         </w:tc>
@@ -2729,7 +2729,7 @@
           </w:tcPr>
           <w:p>
             <w:r>
-              <w:t xml:space="preserve">FastAPI server — REST endpoints, WebSocket streaming, auth middleware, rate limiting.</w:t>
+              <w:t xml:space="preserve">Python backend — REST endpoints, WebSocket streaming, auth middleware, rate limiting.</w:t>
             </w:r>
           </w:p>
         </w:tc>
@@ -2825,7 +2825,7 @@
           </w:tcPr>
           <w:p>
             <w:r>
-              <w:t xml:space="preserve">MongoDB (skills, agents, memory, RAG chunks, logs) + Redis (task queue, cache).</w:t>
+              <w:t xml:space="preserve">MongoDB (skills, agents, memory, RAG chunks, logs) + optional message queue (cache, background tasks).</w:t>
             </w:r>
           </w:p>
         </w:tc>
@@ -2873,7 +2873,7 @@
           </w:tcPr>
           <w:p>
             <w:r>
-              <w:t xml:space="preserve">LiteLLM (LLM providers), MCP Servers (tools), OS APIs (desktop only).</w:t>
+              <w:t xml:space="preserve">LLM Gateway (multiple providers), MCP Servers (external tools), OS APIs (desktop only).</w:t>
             </w:r>
           </w:p>
         </w:tc>
@@ -2979,7 +2979,7 @@
     </w:p>
     <w:p>
       <w:r>
-        <w:t xml:space="preserve">The execution engine. Accepts a task and skill, assembles context (RAG + memory + tools), calls the LLM via LiteLLM, and loops on tool calls until a final response is ready. Implements ReAct and Plan-and-Execute strategies.</w:t>
+        <w:t xml:space="preserve">The execution engine. Accepts a task and skill, assembles context from RAG and memory, calls the LLM via the LLM Gateway, and loops on tool calls until a final response is ready. Supports multiple agent strategies such as ReAct and Plan-and-Execute.</w:t>
       </w:r>
     </w:p>
     <w:p>
@@ -2995,7 +2995,7 @@
     </w:p>
     <w:p>
       <w:r>
-        <w:t xml:space="preserve">Discovers and loads skills from /skills at startup. Each skill is a folder with skill.yaml (name, description, prompt template, required tools, default model) and an optional handler.py. Skills are stored in MongoDB for runtime querying and UI display.</w:t>
+        <w:t xml:space="preserve">Discovers and loads skills at startup. Each skill is a self-contained module with a configuration file (name, description, prompt template, required tools, preferred model) and optional custom logic. Skills are stored in MongoDB for runtime querying and UI display.</w:t>
       </w:r>
     </w:p>
     <w:p>
@@ -3011,7 +3011,7 @@
     </w:p>
     <w:p>
       <w:r>
-        <w:t xml:space="preserve">Maintains a catalog of connected MCP servers and their tool manifests. New servers are added via mcp_servers.yaml. All tools are merged into a single namespace for the Agent Runner.</w:t>
+        <w:t xml:space="preserve">Maintains a catalog of connected MCP servers and their tool manifests. New servers are registered via configuration. All tools are merged into a single namespace available to the Agent Runner.</w:t>
       </w:r>
     </w:p>
     <w:p>
@@ -3027,7 +3027,7 @@
     </w:p>
     <w:p>
       <w:r>
-        <w:t xml:space="preserve">Ingests documents (chunk, embed, store in MongoDB), retrieves top-k chunks by vector similarity at query time, and injects them into the agent context. Supports multiple named namespaces (knowledge bases).</w:t>
+        <w:t xml:space="preserve">Ingests documents by chunking, embedding, and storing them in MongoDB. At query time, retrieves the most relevant chunks by vector similarity and injects them into the agent context. Supports multiple named knowledge bases.</w:t>
       </w:r>
     </w:p>
     <w:p>
@@ -3069,7 +3069,17 @@
         <w:rPr>
           <w:color w:val="1F4E79"/>
         </w:rPr>
-        <w:t xml:space="preserve">6. Project Folder Structure</w:t>
+        <w:t xml:space="preserve">6. High-Level Folder Structure</w:t>
+      </w:r>
+    </w:p>
+    <w:p>
+      <w:r>
+        <w:t xml:space="preserve">The repository is a monorepo with four top-level areas. Specific file names and sub-structures will be confirmed during implementation.</w:t>
+      </w:r>
+    </w:p>
+    <w:p>
+      <w:r>
+        <w:t xml:space="preserve"/>
       </w:r>
     </w:p>
     <w:p>
@@ -3089,7 +3099,7 @@
           <w:sz w:val="18"/>
           <w:szCs w:val="18"/>
         </w:rPr>
-        <w:t xml:space="preserve">├── backend/                    # Python FastAPI server (shared)</w:t>
+        <w:t xml:space="preserve">├── backend/                    # Python API server (shared by web + desktop)</w:t>
       </w:r>
     </w:p>
     <w:p>
@@ -3099,7 +3109,7 @@
           <w:sz w:val="18"/>
           <w:szCs w:val="18"/>
         </w:rPr>
-        <w:t xml:space="preserve">│   ├── core/</w:t>
+        <w:t xml:space="preserve">│   ├── core/                   # Agent runner, skill registry, MCP registry</w:t>
       </w:r>
     </w:p>
     <w:p>
@@ -3109,7 +3119,7 @@
           <w:sz w:val="18"/>
           <w:szCs w:val="18"/>
         </w:rPr>
-        <w:t xml:space="preserve">│   │   ├── agent_runner.py</w:t>
+        <w:t xml:space="preserve">│   ├── skills/                 # Plug-and-play skill modules</w:t>
       </w:r>
     </w:p>
     <w:p>
@@ -3119,7 +3129,7 @@
           <w:sz w:val="18"/>
           <w:szCs w:val="18"/>
         </w:rPr>
-        <w:t xml:space="preserve">│   │   ├── skill_registry.py</w:t>
+        <w:t xml:space="preserve">│   ├── rag/                    # RAG ingestion and retrieval</w:t>
       </w:r>
     </w:p>
     <w:p>
@@ -3129,7 +3139,7 @@
           <w:sz w:val="18"/>
           <w:szCs w:val="18"/>
         </w:rPr>
-        <w:t xml:space="preserve">│   │   ├── mcp_registry.py</w:t>
+        <w:t xml:space="preserve">│   ├── memory/                 # Short-term, long-term, entity memory</w:t>
       </w:r>
     </w:p>
     <w:p>
@@ -3139,7 +3149,7 @@
           <w:sz w:val="18"/>
           <w:szCs w:val="18"/>
         </w:rPr>
-        <w:t xml:space="preserve">│   │   ├── rag_engine.py</w:t>
+        <w:t xml:space="preserve">│   ├── api/                    # API route handlers</w:t>
       </w:r>
     </w:p>
     <w:p>
@@ -3149,7 +3159,7 @@
           <w:sz w:val="18"/>
           <w:szCs w:val="18"/>
         </w:rPr>
-        <w:t xml:space="preserve">│   │   └── memory_manager.py</w:t>
+        <w:t xml:space="preserve">│   └── db/                     # Database connection and helpers</w:t>
       </w:r>
     </w:p>
     <w:p>
@@ -3159,7 +3169,7 @@
           <w:sz w:val="18"/>
           <w:szCs w:val="18"/>
         </w:rPr>
-        <w:t xml:space="preserve">│   ├── skills/</w:t>
+        <w:t xml:space="preserve">├── frontend/                   # TypeScript / React SPA (web + desktop)</w:t>
       </w:r>
     </w:p>
     <w:p>
@@ -3169,7 +3179,7 @@
           <w:sz w:val="18"/>
           <w:szCs w:val="18"/>
         </w:rPr>
-        <w:t xml:space="preserve">│   ├── mcp_servers/</w:t>
+        <w:t xml:space="preserve">│   ├── src/</w:t>
       </w:r>
     </w:p>
     <w:p>
@@ -3179,7 +3189,7 @@
           <w:sz w:val="18"/>
           <w:szCs w:val="18"/>
         </w:rPr>
-        <w:t xml:space="preserve">│   ├── models/</w:t>
+        <w:t xml:space="preserve">│   │   ├── components/</w:t>
       </w:r>
     </w:p>
     <w:p>
@@ -3189,7 +3199,7 @@
           <w:sz w:val="18"/>
           <w:szCs w:val="18"/>
         </w:rPr>
-        <w:t xml:space="preserve">│   ├── api/</w:t>
+        <w:t xml:space="preserve">│   │   ├── pages/</w:t>
       </w:r>
     </w:p>
     <w:p>
@@ -3199,7 +3209,7 @@
           <w:sz w:val="18"/>
           <w:szCs w:val="18"/>
         </w:rPr>
-        <w:t xml:space="preserve">│   ├── db/</w:t>
+        <w:t xml:space="preserve">│   │   └── desktop-bridge/     # IPC bridge (no-op stub for web)</w:t>
       </w:r>
     </w:p>
     <w:p>
@@ -3209,7 +3219,7 @@
           <w:sz w:val="18"/>
           <w:szCs w:val="18"/>
         </w:rPr>
-        <w:t xml:space="preserve">│   └── main.py</w:t>
+        <w:t xml:space="preserve">│   └── package.json</w:t>
       </w:r>
     </w:p>
     <w:p>
@@ -3219,7 +3229,7 @@
           <w:sz w:val="18"/>
           <w:szCs w:val="18"/>
         </w:rPr>
-        <w:t xml:space="preserve">├── frontend/                   # React SPA (web + desktop)</w:t>
+        <w:t xml:space="preserve">├── desktop/                    # Desktop shell (Electron)</w:t>
       </w:r>
     </w:p>
     <w:p>
@@ -3229,7 +3239,7 @@
           <w:sz w:val="18"/>
           <w:szCs w:val="18"/>
         </w:rPr>
-        <w:t xml:space="preserve">│   ├── src/</w:t>
+        <w:t xml:space="preserve">│   ├── main/                   # Main process: window, backend lifecycle</w:t>
       </w:r>
     </w:p>
     <w:p>
@@ -3239,7 +3249,7 @@
           <w:sz w:val="18"/>
           <w:szCs w:val="18"/>
         </w:rPr>
-        <w:t xml:space="preserve">│   │   ├── components/</w:t>
+        <w:t xml:space="preserve">│   └── ipc/                    # IPC handlers: file system, tray, notifications</w:t>
       </w:r>
     </w:p>
     <w:p>
@@ -3249,7 +3259,7 @@
           <w:sz w:val="18"/>
           <w:szCs w:val="18"/>
         </w:rPr>
-        <w:t xml:space="preserve">│   │   ├── pages/</w:t>
+        <w:t xml:space="preserve">├── config/                     # Skill manifests, MCP server list, app settings</w:t>
       </w:r>
     </w:p>
     <w:p>
@@ -3259,7 +3269,7 @@
           <w:sz w:val="18"/>
           <w:szCs w:val="18"/>
         </w:rPr>
-        <w:t xml:space="preserve">│   │   ├── hooks/</w:t>
+        <w:t xml:space="preserve">├── deploy/                     # Container and infrastructure configs</w:t>
       </w:r>
     </w:p>
     <w:p>
@@ -3269,7 +3279,7 @@
           <w:sz w:val="18"/>
           <w:szCs w:val="18"/>
         </w:rPr>
-        <w:t xml:space="preserve">│   │   └── electron-bridge.ts</w:t>
+        <w:t xml:space="preserve">├── docs/                       # Architecture docs, ADRs, runbooks</w:t>
       </w:r>
     </w:p>
     <w:p>
@@ -3279,147 +3289,7 @@
           <w:sz w:val="18"/>
           <w:szCs w:val="18"/>
         </w:rPr>
-        <w:t xml:space="preserve">│   └── package.json</w:t>
-      </w:r>
-    </w:p>
-    <w:p>
-      <w:r>
-        <w:rPr>
-          <w:rFonts w:ascii="Courier New" w:cs="Courier New" w:eastAsia="Courier New" w:hAnsi="Courier New"/>
-          <w:sz w:val="18"/>
-          <w:szCs w:val="18"/>
-        </w:rPr>
-        <w:t xml:space="preserve">├── electron/                   # Electron main process</w:t>
-      </w:r>
-    </w:p>
-    <w:p>
-      <w:r>
-        <w:rPr>
-          <w:rFonts w:ascii="Courier New" w:cs="Courier New" w:eastAsia="Courier New" w:hAnsi="Courier New"/>
-          <w:sz w:val="18"/>
-          <w:szCs w:val="18"/>
-        </w:rPr>
-        <w:t xml:space="preserve">│   ├── main.ts</w:t>
-      </w:r>
-    </w:p>
-    <w:p>
-      <w:r>
-        <w:rPr>
-          <w:rFonts w:ascii="Courier New" w:cs="Courier New" w:eastAsia="Courier New" w:hAnsi="Courier New"/>
-          <w:sz w:val="18"/>
-          <w:szCs w:val="18"/>
-        </w:rPr>
-        <w:t xml:space="preserve">│   ├── preload.ts</w:t>
-      </w:r>
-    </w:p>
-    <w:p>
-      <w:r>
-        <w:rPr>
-          <w:rFonts w:ascii="Courier New" w:cs="Courier New" w:eastAsia="Courier New" w:hAnsi="Courier New"/>
-          <w:sz w:val="18"/>
-          <w:szCs w:val="18"/>
-        </w:rPr>
-        <w:t xml:space="preserve">│   └── ipc-handlers.ts</w:t>
-      </w:r>
-    </w:p>
-    <w:p>
-      <w:r>
-        <w:rPr>
-          <w:rFonts w:ascii="Courier New" w:cs="Courier New" w:eastAsia="Courier New" w:hAnsi="Courier New"/>
-          <w:sz w:val="18"/>
-          <w:szCs w:val="18"/>
-        </w:rPr>
-        <w:t xml:space="preserve">├── config/</w:t>
-      </w:r>
-    </w:p>
-    <w:p>
-      <w:r>
-        <w:rPr>
-          <w:rFonts w:ascii="Courier New" w:cs="Courier New" w:eastAsia="Courier New" w:hAnsi="Courier New"/>
-          <w:sz w:val="18"/>
-          <w:szCs w:val="18"/>
-        </w:rPr>
-        <w:t xml:space="preserve">│   ├── skills_manifest.yaml</w:t>
-      </w:r>
-    </w:p>
-    <w:p>
-      <w:r>
-        <w:rPr>
-          <w:rFonts w:ascii="Courier New" w:cs="Courier New" w:eastAsia="Courier New" w:hAnsi="Courier New"/>
-          <w:sz w:val="18"/>
-          <w:szCs w:val="18"/>
-        </w:rPr>
-        <w:t xml:space="preserve">│   ├── mcp_servers.yaml</w:t>
-      </w:r>
-    </w:p>
-    <w:p>
-      <w:r>
-        <w:rPr>
-          <w:rFonts w:ascii="Courier New" w:cs="Courier New" w:eastAsia="Courier New" w:hAnsi="Courier New"/>
-          <w:sz w:val="18"/>
-          <w:szCs w:val="18"/>
-        </w:rPr>
-        <w:t xml:space="preserve">│   └── settings.yaml</w:t>
-      </w:r>
-    </w:p>
-    <w:p>
-      <w:r>
-        <w:rPr>
-          <w:rFonts w:ascii="Courier New" w:cs="Courier New" w:eastAsia="Courier New" w:hAnsi="Courier New"/>
-          <w:sz w:val="18"/>
-          <w:szCs w:val="18"/>
-        </w:rPr>
-        <w:t xml:space="preserve">├── docker/</w:t>
-      </w:r>
-    </w:p>
-    <w:p>
-      <w:r>
-        <w:rPr>
-          <w:rFonts w:ascii="Courier New" w:cs="Courier New" w:eastAsia="Courier New" w:hAnsi="Courier New"/>
-          <w:sz w:val="18"/>
-          <w:szCs w:val="18"/>
-        </w:rPr>
-        <w:t xml:space="preserve">│   ├── Dockerfile</w:t>
-      </w:r>
-    </w:p>
-    <w:p>
-      <w:r>
-        <w:rPr>
-          <w:rFonts w:ascii="Courier New" w:cs="Courier New" w:eastAsia="Courier New" w:hAnsi="Courier New"/>
-          <w:sz w:val="18"/>
-          <w:szCs w:val="18"/>
-        </w:rPr>
-        <w:t xml:space="preserve">│   └── docker-compose.yml</w:t>
-      </w:r>
-    </w:p>
-    <w:p>
-      <w:r>
-        <w:rPr>
-          <w:rFonts w:ascii="Courier New" w:cs="Courier New" w:eastAsia="Courier New" w:hAnsi="Courier New"/>
-          <w:sz w:val="18"/>
-          <w:szCs w:val="18"/>
-        </w:rPr>
-        <w:t xml:space="preserve">├── docs/</w:t>
-      </w:r>
-    </w:p>
-    <w:p>
-      <w:r>
-        <w:rPr>
-          <w:rFonts w:ascii="Courier New" w:cs="Courier New" w:eastAsia="Courier New" w:hAnsi="Courier New"/>
-          <w:sz w:val="18"/>
-          <w:szCs w:val="18"/>
-        </w:rPr>
-        <w:t xml:space="preserve">├── tests/</w:t>
-      </w:r>
-    </w:p>
-    <w:p>
-      <w:r>
-        <w:rPr>
-          <w:rFonts w:ascii="Courier New" w:cs="Courier New" w:eastAsia="Courier New" w:hAnsi="Courier New"/>
-          <w:sz w:val="18"/>
-          <w:szCs w:val="18"/>
-        </w:rPr>
-        <w:t xml:space="preserve">└── .env.example</w:t>
+        <w:t xml:space="preserve">└── tests/</w:t>
       </w:r>
     </w:p>
     <w:p>
@@ -4166,7 +4036,7 @@
         </w:numPr>
       </w:pPr>
       <w:r>
-        <w:t xml:space="preserve">Create a folder under backend/skills/your_skill_name/.</w:t>
+        <w:t xml:space="preserve">Create a new skill module folder under the skills directory.</w:t>
       </w:r>
     </w:p>
     <w:p>
@@ -4178,7 +4048,7 @@
         </w:numPr>
       </w:pPr>
       <w:r>
-        <w:t xml:space="preserve">Add skill.yaml with: name, description, prompt_template, required_tools, and default_model.</w:t>
+        <w:t xml:space="preserve">Add a configuration file with: name, description, prompt template, required tools, and preferred model.</w:t>
       </w:r>
     </w:p>
     <w:p>
@@ -4190,7 +4060,7 @@
         </w:numPr>
       </w:pPr>
       <w:r>
-        <w:t xml:space="preserve">Optionally add handler.py for custom pre/post-processing logic.</w:t>
+        <w:t xml:space="preserve">Optionally add custom handler logic for pre/post-processing.</w:t>
       </w:r>
     </w:p>
     <w:p>
@@ -4202,7 +4072,7 @@
         </w:numPr>
       </w:pPr>
       <w:r>
-        <w:t xml:space="preserve">Restart the backend — the Skill Registry auto-discovers and loads it into MongoDB.</w:t>
+        <w:t xml:space="preserve">Restart the backend — the Skill Registry auto-discovers and registers it in MongoDB.</w:t>
       </w:r>
     </w:p>
     <w:p>
@@ -4230,7 +4100,7 @@
         </w:numPr>
       </w:pPr>
       <w:r>
-        <w:t xml:space="preserve">Add a server entry to config/mcp_servers.yaml with name, endpoint, and auth type.</w:t>
+        <w:t xml:space="preserve">Register the new server in the MCP server configuration file with its name, endpoint, and auth method.</w:t>
       </w:r>
     </w:p>
     <w:p>
@@ -4242,7 +4112,7 @@
         </w:numPr>
       </w:pPr>
       <w:r>
-        <w:t xml:space="preserve">The MCP Registry fetches the server tool manifest at startup and merges all tools.</w:t>
+        <w:t xml:space="preserve">The MCP Registry fetches the server’s tool manifest at startup and merges all tools into the shared namespace.</w:t>
       </w:r>
     </w:p>
     <w:p>
@@ -4270,7 +4140,7 @@
         </w:numPr>
       </w:pPr>
       <w:r>
-        <w:t xml:space="preserve">All LLM calls go through LiteLLM. Add a provider entry to settings.yaml.</w:t>
+        <w:t xml:space="preserve">All LLM calls go through the LLM Gateway abstraction layer. Add the new provider to the application settings.</w:t>
       </w:r>
     </w:p>
     <w:p>
@@ -4282,7 +4152,7 @@
         </w:numPr>
       </w:pPr>
       <w:r>
-        <w:t xml:space="preserve">No code changes required — any LiteLLM-supported provider is immediately available.</w:t>
+        <w:t xml:space="preserve">No code changes required — any provider supported by the gateway is immediately available to all agents and skills.</w:t>
       </w:r>
     </w:p>
     <w:p>
@@ -4509,7 +4379,7 @@
           </w:tcPr>
           <w:p>
             <w:r>
-              <w:t xml:space="preserve">FastAPI, MongoDB, LiteLLM, Skill Registry, 2 starter skills</w:t>
+              <w:t xml:space="preserve">Backend API, MongoDB integration, LLM Gateway, Skill Registry, 2 starter skills</w:t>
             </w:r>
           </w:p>
         </w:tc>
@@ -4603,7 +4473,7 @@
           </w:tcPr>
           <w:p>
             <w:r>
-              <w:t xml:space="preserve">Agent Runner (ReAct), MCP Registry, 3+ MCP servers, WebSocket streaming</w:t>
+              <w:t xml:space="preserve">Agent Runner, MCP Registry, initial MCP server integrations, streaming responses</w:t>
             </w:r>
           </w:p>
         </w:tc>
@@ -4697,7 +4567,7 @@
           </w:tcPr>
           <w:p>
             <w:r>
-              <w:t xml:space="preserve">RAG pipeline, short- and long-term memory, MongoDB vector search</w:t>
+              <w:t xml:space="preserve">RAG ingestion and retrieval pipeline, short- and long-term memory</w:t>
             </w:r>
           </w:p>
         </w:tc>
@@ -4791,7 +4661,7 @@
           </w:tcPr>
           <w:p>
             <w:r>
-              <w:t xml:space="preserve">React SPA, chat UI, Skill launcher, Settings, Docker packaging</w:t>
+              <w:t xml:space="preserve">React frontend, chat UI, Skill launcher, Settings panel, containerised deployment</w:t>
             </w:r>
           </w:p>
         </w:tc>
@@ -4862,7 +4732,7 @@
           </w:tcPr>
           <w:p>
             <w:r>
-              <w:t xml:space="preserve">Electron shell</w:t>
+              <w:t xml:space="preserve">Desktop shell</w:t>
             </w:r>
           </w:p>
         </w:tc>
@@ -4885,7 +4755,7 @@
           </w:tcPr>
           <w:p>
             <w:r>
-              <w:t xml:space="preserve">Electron wrapper, IPC bridge, local file browser, tray, installer</w:t>
+              <w:t xml:space="preserve">Desktop wrapper, IPC bridge, local file browser, system tray, packaged installer</w:t>
             </w:r>
           </w:p>
         </w:tc>
@@ -4979,7 +4849,7 @@
           </w:tcPr>
           <w:p>
             <w:r>
-              <w:t xml:space="preserve">Auth, logging, telemetry, auto-update, end-to-end tests, CI/CD</w:t>
+              <w:t xml:space="preserve">Auth, logging, telemetry, auto-update, end-to-end tests, CI/CD pipeline</w:t>
             </w:r>
           </w:p>
         </w:tc>
@@ -5043,7 +4913,7 @@
         </w:numPr>
       </w:pPr>
       <w:r>
-        <w:t xml:space="preserve">All API keys and MongoDB credentials live in environment variables or the OS keychain — never hard-coded.</w:t>
+        <w:t xml:space="preserve">All credentials and API keys are stored in environment variables or a secrets manager — never hard-coded.</w:t>
       </w:r>
     </w:p>
     <w:p>
@@ -5055,7 +4925,7 @@
         </w:numPr>
       </w:pPr>
       <w:r>
-        <w:t xml:space="preserve">Web deployment: FastAPI behind Nginx/reverse proxy with HTTPS; JWT auth on all endpoints.</w:t>
+        <w:t xml:space="preserve">Web deployment: backend sits behind a reverse proxy with HTTPS; all endpoints require authentication.</w:t>
       </w:r>
     </w:p>
     <w:p>
@@ -5067,7 +4937,7 @@
         </w:numPr>
       </w:pPr>
       <w:r>
-        <w:t xml:space="preserve">Desktop deployment: FastAPI binds to localhost only; Electron communicates over loopback.</w:t>
+        <w:t xml:space="preserve">Desktop deployment: the backend binds to loopback only; the desktop shell communicates locally and requires no inbound network access.</w:t>
       </w:r>
     </w:p>
     <w:p>
@@ -5079,7 +4949,7 @@
         </w:numPr>
       </w:pPr>
       <w:r>
-        <w:t xml:space="preserve">File system access (desktop) is limited to user-approved directories via Electron IPC.</w:t>
+        <w:t xml:space="preserve">Local file system access is limited to user-approved directories.</w:t>
       </w:r>
     </w:p>
     <w:p>
@@ -5091,7 +4961,7 @@
         </w:numPr>
       </w:pPr>
       <w:r>
-        <w:t xml:space="preserve">All agent tool calls are logged to MongoDB for auditability.</w:t>
+        <w:t xml:space="preserve">All agent actions and tool calls are logged to MongoDB for auditability.</w:t>
       </w:r>
     </w:p>
     <w:p>
@@ -5141,7 +5011,7 @@
         </w:numPr>
       </w:pPr>
       <w:r>
-        <w:t xml:space="preserve">Scaffold the monorepo (backend/ + frontend/ + electron/ + docker/ + config/).</w:t>
+        <w:t xml:space="preserve">Scaffold the monorepo with the top-level folder structure agreed in Section 6.</w:t>
       </w:r>
     </w:p>
     <w:p>
@@ -5153,7 +5023,7 @@
         </w:numPr>
       </w:pPr>
       <w:r>
-        <w:t xml:space="preserve">Set up MongoDB Atlas (free tier) and configure .env.</w:t>
+        <w:t xml:space="preserve">Provision a MongoDB instance and configure environment variables.</w:t>
       </w:r>
     </w:p>
     <w:p>
@@ -5165,7 +5035,7 @@
         </w:numPr>
       </w:pPr>
       <w:r>
-        <w:t xml:space="preserve">Build Phase 1: FastAPI + LiteLLM + Skill Registry + 2 starter skills.</w:t>
+        <w:t xml:space="preserve">Build Phase 1: backend API, LLM Gateway integration, Skill Registry, and 2 starter skills.</w:t>
       </w:r>
     </w:p>
     <w:p>

</xml_diff>

<commit_message>
docs: add UI rich text rendering section (Section 9)
- New Section 9 covering the three-library rendering strategy:
  react-markdown for chat/agent output, Tiptap for editable content,
  and Shiki for code syntax highlighting
- Includes plugin recommendations (remark-gfm, rehype-sanitize,
  rehype-highlight) and rationale for each surface
- Renumbered subsequent sections (10 Security → 11, 11 Next Steps → 12)

Co-Authored-By: Claude Sonnet 4.6 <noreply@anthropic.com>
</commit_message>
<xml_diff>
--- a/AI_Workbench_Architecture.docx
+++ b/AI_Workbench_Architecture.docx
@@ -4178,7 +4178,588 @@
         <w:rPr>
           <w:color w:val="1F4E79"/>
         </w:rPr>
-        <w:t xml:space="preserve">9. Implementation Roadmap</w:t>
+        <w:t xml:space="preserve">9. UI Rich Text Rendering</w:t>
+      </w:r>
+    </w:p>
+    <w:p>
+      <w:r>
+        <w:t xml:space="preserve">The AI Workbench UI uses three complementary libraries to render rich text across different surfaces. Each is chosen for a specific job so no single library is stretched beyond its purpose.</w:t>
+      </w:r>
+    </w:p>
+    <w:p>
+      <w:r>
+        <w:t xml:space="preserve"/>
+      </w:r>
+    </w:p>
+    <w:tbl>
+      <w:tblPr>
+        <w:tblW w:type="dxa" w:w="9360"/>
+        <w:tblBorders>
+          <w:top w:val="single" w:color="auto" w:sz="4"/>
+          <w:left w:val="single" w:color="auto" w:sz="4"/>
+          <w:bottom w:val="single" w:color="auto" w:sz="4"/>
+          <w:right w:val="single" w:color="auto" w:sz="4"/>
+          <w:insideH w:val="single" w:color="auto" w:sz="4"/>
+          <w:insideV w:val="single" w:color="auto" w:sz="4"/>
+        </w:tblBorders>
+      </w:tblPr>
+      <w:tblGrid>
+        <w:gridCol w:w="2000"/>
+        <w:gridCol w:w="2200"/>
+        <w:gridCol w:w="5160"/>
+      </w:tblGrid>
+      <w:tr>
+        <w:tc>
+          <w:tcPr>
+            <w:tcW w:type="dxa" w:w="2000"/>
+            <w:tcBorders>
+              <w:top w:val="single" w:color="1F4E79" w:sz="1"/>
+              <w:left w:val="single" w:color="1F4E79" w:sz="1"/>
+              <w:bottom w:val="single" w:color="1F4E79" w:sz="1"/>
+              <w:right w:val="single" w:color="1F4E79" w:sz="1"/>
+            </w:tcBorders>
+            <w:shd w:fill="1F4E79" w:val="clear"/>
+            <w:tcMar>
+              <w:top w:type="dxa" w:w="80"/>
+              <w:left w:type="dxa" w:w="120"/>
+              <w:bottom w:type="dxa" w:w="80"/>
+              <w:right w:type="dxa" w:w="120"/>
+            </w:tcMar>
+          </w:tcPr>
+          <w:p>
+            <w:r>
+              <w:rPr>
+                <w:b/>
+                <w:bCs/>
+                <w:color w:val="FFFFFF"/>
+              </w:rPr>
+              <w:t xml:space="preserve">Surface</w:t>
+            </w:r>
+          </w:p>
+        </w:tc>
+        <w:tc>
+          <w:tcPr>
+            <w:tcW w:type="dxa" w:w="2200"/>
+            <w:tcBorders>
+              <w:top w:val="single" w:color="1F4E79" w:sz="1"/>
+              <w:left w:val="single" w:color="1F4E79" w:sz="1"/>
+              <w:bottom w:val="single" w:color="1F4E79" w:sz="1"/>
+              <w:right w:val="single" w:color="1F4E79" w:sz="1"/>
+            </w:tcBorders>
+            <w:shd w:fill="1F4E79" w:val="clear"/>
+            <w:tcMar>
+              <w:top w:type="dxa" w:w="80"/>
+              <w:left w:type="dxa" w:w="120"/>
+              <w:bottom w:type="dxa" w:w="80"/>
+              <w:right w:type="dxa" w:w="120"/>
+            </w:tcMar>
+          </w:tcPr>
+          <w:p>
+            <w:r>
+              <w:rPr>
+                <w:b/>
+                <w:bCs/>
+                <w:color w:val="FFFFFF"/>
+              </w:rPr>
+              <w:t xml:space="preserve">Library</w:t>
+            </w:r>
+          </w:p>
+        </w:tc>
+        <w:tc>
+          <w:tcPr>
+            <w:tcW w:type="dxa" w:w="5160"/>
+            <w:tcBorders>
+              <w:top w:val="single" w:color="1F4E79" w:sz="1"/>
+              <w:left w:val="single" w:color="1F4E79" w:sz="1"/>
+              <w:bottom w:val="single" w:color="1F4E79" w:sz="1"/>
+              <w:right w:val="single" w:color="1F4E79" w:sz="1"/>
+            </w:tcBorders>
+            <w:shd w:fill="1F4E79" w:val="clear"/>
+            <w:tcMar>
+              <w:top w:type="dxa" w:w="80"/>
+              <w:left w:type="dxa" w:w="120"/>
+              <w:bottom w:type="dxa" w:w="80"/>
+              <w:right w:type="dxa" w:w="120"/>
+            </w:tcMar>
+          </w:tcPr>
+          <w:p>
+            <w:r>
+              <w:rPr>
+                <w:b/>
+                <w:bCs/>
+                <w:color w:val="FFFFFF"/>
+              </w:rPr>
+              <w:t xml:space="preserve">Why</w:t>
+            </w:r>
+          </w:p>
+        </w:tc>
+      </w:tr>
+      <w:tr>
+        <w:tc>
+          <w:tcPr>
+            <w:tcW w:type="dxa" w:w="2000"/>
+            <w:tcBorders>
+              <w:top w:val="single" w:color="CCCCCC" w:sz="1"/>
+              <w:left w:val="single" w:color="CCCCCC" w:sz="1"/>
+              <w:bottom w:val="single" w:color="CCCCCC" w:sz="1"/>
+              <w:right w:val="single" w:color="CCCCCC" w:sz="1"/>
+            </w:tcBorders>
+            <w:shd w:fill="F0F4FA" w:val="clear"/>
+            <w:tcMar>
+              <w:top w:type="dxa" w:w="80"/>
+              <w:left w:type="dxa" w:w="120"/>
+              <w:bottom w:type="dxa" w:w="80"/>
+              <w:right w:type="dxa" w:w="120"/>
+            </w:tcMar>
+          </w:tcPr>
+          <w:p>
+            <w:r>
+              <w:t xml:space="preserve">Chat / agent responses</w:t>
+            </w:r>
+          </w:p>
+        </w:tc>
+        <w:tc>
+          <w:tcPr>
+            <w:tcW w:type="dxa" w:w="2200"/>
+            <w:tcBorders>
+              <w:top w:val="single" w:color="CCCCCC" w:sz="1"/>
+              <w:left w:val="single" w:color="CCCCCC" w:sz="1"/>
+              <w:bottom w:val="single" w:color="CCCCCC" w:sz="1"/>
+              <w:right w:val="single" w:color="CCCCCC" w:sz="1"/>
+            </w:tcBorders>
+            <w:shd w:fill="F0F4FA" w:val="clear"/>
+            <w:tcMar>
+              <w:top w:type="dxa" w:w="80"/>
+              <w:left w:type="dxa" w:w="120"/>
+              <w:bottom w:type="dxa" w:w="80"/>
+              <w:right w:type="dxa" w:w="120"/>
+            </w:tcMar>
+          </w:tcPr>
+          <w:p>
+            <w:r>
+              <w:t xml:space="preserve">react-markdown</w:t>
+            </w:r>
+          </w:p>
+        </w:tc>
+        <w:tc>
+          <w:tcPr>
+            <w:tcW w:type="dxa" w:w="5160"/>
+            <w:tcBorders>
+              <w:top w:val="single" w:color="CCCCCC" w:sz="1"/>
+              <w:left w:val="single" w:color="CCCCCC" w:sz="1"/>
+              <w:bottom w:val="single" w:color="CCCCCC" w:sz="1"/>
+              <w:right w:val="single" w:color="CCCCCC" w:sz="1"/>
+            </w:tcBorders>
+            <w:shd w:fill="F0F4FA" w:val="clear"/>
+            <w:tcMar>
+              <w:top w:type="dxa" w:w="80"/>
+              <w:left w:type="dxa" w:w="120"/>
+              <w:bottom w:type="dxa" w:w="80"/>
+              <w:right w:type="dxa" w:w="120"/>
+            </w:tcMar>
+          </w:tcPr>
+          <w:p>
+            <w:r>
+              <w:t xml:space="preserve">Converts Markdown strings to React elements. Lightweight and read-only — ideal for streaming LLM output token by token.</w:t>
+            </w:r>
+          </w:p>
+        </w:tc>
+      </w:tr>
+      <w:tr>
+        <w:tc>
+          <w:tcPr>
+            <w:tcW w:type="dxa" w:w="2000"/>
+            <w:tcBorders>
+              <w:top w:val="single" w:color="CCCCCC" w:sz="1"/>
+              <w:left w:val="single" w:color="CCCCCC" w:sz="1"/>
+              <w:bottom w:val="single" w:color="CCCCCC" w:sz="1"/>
+              <w:right w:val="single" w:color="CCCCCC" w:sz="1"/>
+            </w:tcBorders>
+            <w:shd w:fill="FFFFFF" w:val="clear"/>
+            <w:tcMar>
+              <w:top w:type="dxa" w:w="80"/>
+              <w:left w:type="dxa" w:w="120"/>
+              <w:bottom w:type="dxa" w:w="80"/>
+              <w:right w:type="dxa" w:w="120"/>
+            </w:tcMar>
+          </w:tcPr>
+          <w:p>
+            <w:r>
+              <w:t xml:space="preserve">Code blocks</w:t>
+            </w:r>
+          </w:p>
+        </w:tc>
+        <w:tc>
+          <w:tcPr>
+            <w:tcW w:type="dxa" w:w="2200"/>
+            <w:tcBorders>
+              <w:top w:val="single" w:color="CCCCCC" w:sz="1"/>
+              <w:left w:val="single" w:color="CCCCCC" w:sz="1"/>
+              <w:bottom w:val="single" w:color="CCCCCC" w:sz="1"/>
+              <w:right w:val="single" w:color="CCCCCC" w:sz="1"/>
+            </w:tcBorders>
+            <w:shd w:fill="FFFFFF" w:val="clear"/>
+            <w:tcMar>
+              <w:top w:type="dxa" w:w="80"/>
+              <w:left w:type="dxa" w:w="120"/>
+              <w:bottom w:type="dxa" w:w="80"/>
+              <w:right w:type="dxa" w:w="120"/>
+            </w:tcMar>
+          </w:tcPr>
+          <w:p>
+            <w:r>
+              <w:t xml:space="preserve">Shiki</w:t>
+            </w:r>
+          </w:p>
+        </w:tc>
+        <w:tc>
+          <w:tcPr>
+            <w:tcW w:type="dxa" w:w="5160"/>
+            <w:tcBorders>
+              <w:top w:val="single" w:color="CCCCCC" w:sz="1"/>
+              <w:left w:val="single" w:color="CCCCCC" w:sz="1"/>
+              <w:bottom w:val="single" w:color="CCCCCC" w:sz="1"/>
+              <w:right w:val="single" w:color="CCCCCC" w:sz="1"/>
+            </w:tcBorders>
+            <w:shd w:fill="FFFFFF" w:val="clear"/>
+            <w:tcMar>
+              <w:top w:type="dxa" w:w="80"/>
+              <w:left w:type="dxa" w:w="120"/>
+              <w:bottom w:type="dxa" w:w="80"/>
+              <w:right w:type="dxa" w:w="120"/>
+            </w:tcMar>
+          </w:tcPr>
+          <w:p>
+            <w:r>
+              <w:t xml:space="preserve">Uses VS Code grammar files for syntax highlighting. Works as a plugin inside react-markdown or standalone anywhere in the UI.</w:t>
+            </w:r>
+          </w:p>
+        </w:tc>
+      </w:tr>
+      <w:tr>
+        <w:tc>
+          <w:tcPr>
+            <w:tcW w:type="dxa" w:w="2000"/>
+            <w:tcBorders>
+              <w:top w:val="single" w:color="CCCCCC" w:sz="1"/>
+              <w:left w:val="single" w:color="CCCCCC" w:sz="1"/>
+              <w:bottom w:val="single" w:color="CCCCCC" w:sz="1"/>
+              <w:right w:val="single" w:color="CCCCCC" w:sz="1"/>
+            </w:tcBorders>
+            <w:shd w:fill="F0F4FA" w:val="clear"/>
+            <w:tcMar>
+              <w:top w:type="dxa" w:w="80"/>
+              <w:left w:type="dxa" w:w="120"/>
+              <w:bottom w:type="dxa" w:w="80"/>
+              <w:right w:type="dxa" w:w="120"/>
+            </w:tcMar>
+          </w:tcPr>
+          <w:p>
+            <w:r>
+              <w:t xml:space="preserve">Editable content (skill prompts, memory notes, documents)</w:t>
+            </w:r>
+          </w:p>
+        </w:tc>
+        <w:tc>
+          <w:tcPr>
+            <w:tcW w:type="dxa" w:w="2200"/>
+            <w:tcBorders>
+              <w:top w:val="single" w:color="CCCCCC" w:sz="1"/>
+              <w:left w:val="single" w:color="CCCCCC" w:sz="1"/>
+              <w:bottom w:val="single" w:color="CCCCCC" w:sz="1"/>
+              <w:right w:val="single" w:color="CCCCCC" w:sz="1"/>
+            </w:tcBorders>
+            <w:shd w:fill="F0F4FA" w:val="clear"/>
+            <w:tcMar>
+              <w:top w:type="dxa" w:w="80"/>
+              <w:left w:type="dxa" w:w="120"/>
+              <w:bottom w:type="dxa" w:w="80"/>
+              <w:right w:type="dxa" w:w="120"/>
+            </w:tcMar>
+          </w:tcPr>
+          <w:p>
+            <w:r>
+              <w:t xml:space="preserve">Tiptap (ProseMirror)</w:t>
+            </w:r>
+          </w:p>
+        </w:tc>
+        <w:tc>
+          <w:tcPr>
+            <w:tcW w:type="dxa" w:w="5160"/>
+            <w:tcBorders>
+              <w:top w:val="single" w:color="CCCCCC" w:sz="1"/>
+              <w:left w:val="single" w:color="CCCCCC" w:sz="1"/>
+              <w:bottom w:val="single" w:color="CCCCCC" w:sz="1"/>
+              <w:right w:val="single" w:color="CCCCCC" w:sz="1"/>
+            </w:tcBorders>
+            <w:shd w:fill="F0F4FA" w:val="clear"/>
+            <w:tcMar>
+              <w:top w:type="dxa" w:w="80"/>
+              <w:left w:type="dxa" w:w="120"/>
+              <w:bottom w:type="dxa" w:w="80"/>
+              <w:right w:type="dxa" w:w="120"/>
+            </w:tcMar>
+          </w:tcPr>
+          <w:p>
+            <w:r>
+              <w:t xml:space="preserve">Full WYSIWYG editor with slash commands, toolbar, and tables. Stores content as JSON and can import/export Markdown for LLM compatibility.</w:t>
+            </w:r>
+          </w:p>
+        </w:tc>
+      </w:tr>
+      <w:tr>
+        <w:tc>
+          <w:tcPr>
+            <w:tcW w:type="dxa" w:w="2000"/>
+            <w:tcBorders>
+              <w:top w:val="single" w:color="CCCCCC" w:sz="1"/>
+              <w:left w:val="single" w:color="CCCCCC" w:sz="1"/>
+              <w:bottom w:val="single" w:color="CCCCCC" w:sz="1"/>
+              <w:right w:val="single" w:color="CCCCCC" w:sz="1"/>
+            </w:tcBorders>
+            <w:shd w:fill="FFFFFF" w:val="clear"/>
+            <w:tcMar>
+              <w:top w:type="dxa" w:w="80"/>
+              <w:left w:type="dxa" w:w="120"/>
+              <w:bottom w:type="dxa" w:w="80"/>
+              <w:right w:type="dxa" w:w="120"/>
+            </w:tcMar>
+          </w:tcPr>
+          <w:p>
+            <w:r>
+              <w:t xml:space="preserve">Simple labels and tooltips</w:t>
+            </w:r>
+          </w:p>
+        </w:tc>
+        <w:tc>
+          <w:tcPr>
+            <w:tcW w:type="dxa" w:w="2200"/>
+            <w:tcBorders>
+              <w:top w:val="single" w:color="CCCCCC" w:sz="1"/>
+              <w:left w:val="single" w:color="CCCCCC" w:sz="1"/>
+              <w:bottom w:val="single" w:color="CCCCCC" w:sz="1"/>
+              <w:right w:val="single" w:color="CCCCCC" w:sz="1"/>
+            </w:tcBorders>
+            <w:shd w:fill="FFFFFF" w:val="clear"/>
+            <w:tcMar>
+              <w:top w:type="dxa" w:w="80"/>
+              <w:left w:type="dxa" w:w="120"/>
+              <w:bottom w:type="dxa" w:w="80"/>
+              <w:right w:type="dxa" w:w="120"/>
+            </w:tcMar>
+          </w:tcPr>
+          <w:p>
+            <w:r>
+              <w:t xml:space="preserve">Native HTML</w:t>
+            </w:r>
+          </w:p>
+        </w:tc>
+        <w:tc>
+          <w:tcPr>
+            <w:tcW w:type="dxa" w:w="5160"/>
+            <w:tcBorders>
+              <w:top w:val="single" w:color="CCCCCC" w:sz="1"/>
+              <w:left w:val="single" w:color="CCCCCC" w:sz="1"/>
+              <w:bottom w:val="single" w:color="CCCCCC" w:sz="1"/>
+              <w:right w:val="single" w:color="CCCCCC" w:sz="1"/>
+            </w:tcBorders>
+            <w:shd w:fill="FFFFFF" w:val="clear"/>
+            <w:tcMar>
+              <w:top w:type="dxa" w:w="80"/>
+              <w:left w:type="dxa" w:w="120"/>
+              <w:bottom w:type="dxa" w:w="80"/>
+              <w:right w:type="dxa" w:w="120"/>
+            </w:tcMar>
+          </w:tcPr>
+          <w:p>
+            <w:r>
+              <w:t xml:space="preserve">No library overhead needed for short inline text.</w:t>
+            </w:r>
+          </w:p>
+        </w:tc>
+      </w:tr>
+    </w:tbl>
+    <w:p>
+      <w:r>
+        <w:t xml:space="preserve"/>
+      </w:r>
+    </w:p>
+    <w:p>
+      <w:pPr>
+        <w:pStyle w:val="Heading2"/>
+      </w:pPr>
+      <w:r>
+        <w:rPr>
+          <w:color w:val="2E75B6"/>
+        </w:rPr>
+        <w:t xml:space="preserve">9.1 Chat Pane (react-markdown)</w:t>
+      </w:r>
+    </w:p>
+    <w:p>
+      <w:r>
+        <w:t xml:space="preserve">All agent and LLM responses are streamed as Markdown and rendered using react-markdown. The following plugins are included:</w:t>
+      </w:r>
+    </w:p>
+    <w:p>
+      <w:pPr>
+        <w:pStyle w:val="ListParagraph"/>
+        <w:numPr>
+          <w:ilvl w:val="0"/>
+          <w:numId w:val="2"/>
+        </w:numPr>
+      </w:pPr>
+      <w:r>
+        <w:t xml:space="preserve">remark-gfm — enables GitHub Flavored Markdown: tables, strikethrough, task lists, and autolinks.</w:t>
+      </w:r>
+    </w:p>
+    <w:p>
+      <w:pPr>
+        <w:pStyle w:val="ListParagraph"/>
+        <w:numPr>
+          <w:ilvl w:val="0"/>
+          <w:numId w:val="2"/>
+        </w:numPr>
+      </w:pPr>
+      <w:r>
+        <w:t xml:space="preserve">rehype-highlight or rehype-pretty-code — syntax highlighting for fenced code blocks.</w:t>
+      </w:r>
+    </w:p>
+    <w:p>
+      <w:pPr>
+        <w:pStyle w:val="ListParagraph"/>
+        <w:numPr>
+          <w:ilvl w:val="0"/>
+          <w:numId w:val="2"/>
+        </w:numPr>
+      </w:pPr>
+      <w:r>
+        <w:t xml:space="preserve">rehype-sanitize — strips unsafe HTML from LLM output before rendering.</w:t>
+      </w:r>
+    </w:p>
+    <w:p>
+      <w:r>
+        <w:t xml:space="preserve"/>
+      </w:r>
+    </w:p>
+    <w:p>
+      <w:r>
+        <w:t xml:space="preserve">This stack mirrors what Claude desktop and claude.ai use for rendering assistant messages, giving users a familiar and consistent experience.</w:t>
+      </w:r>
+    </w:p>
+    <w:p>
+      <w:r>
+        <w:t xml:space="preserve"/>
+      </w:r>
+    </w:p>
+    <w:p>
+      <w:pPr>
+        <w:pStyle w:val="Heading2"/>
+      </w:pPr>
+      <w:r>
+        <w:rPr>
+          <w:color w:val="2E75B6"/>
+        </w:rPr>
+        <w:t xml:space="preserve">9.2 Editable Content (Tiptap)</w:t>
+      </w:r>
+    </w:p>
+    <w:p>
+      <w:r>
+        <w:t xml:space="preserve">Any surface where the user actively writes or edits content uses Tiptap, which is built on ProseMirror. This includes skill prompt templates, memory notes, and any document drafting features. Key capabilities:</w:t>
+      </w:r>
+    </w:p>
+    <w:p>
+      <w:pPr>
+        <w:pStyle w:val="ListParagraph"/>
+        <w:numPr>
+          <w:ilvl w:val="0"/>
+          <w:numId w:val="2"/>
+        </w:numPr>
+      </w:pPr>
+      <w:r>
+        <w:t xml:space="preserve">WYSIWYG editing with headings, bold, italic, lists, tables, and code blocks.</w:t>
+      </w:r>
+    </w:p>
+    <w:p>
+      <w:pPr>
+        <w:pStyle w:val="ListParagraph"/>
+        <w:numPr>
+          <w:ilvl w:val="0"/>
+          <w:numId w:val="2"/>
+        </w:numPr>
+      </w:pPr>
+      <w:r>
+        <w:t xml:space="preserve">Slash command menu for inserting blocks quickly.</w:t>
+      </w:r>
+    </w:p>
+    <w:p>
+      <w:pPr>
+        <w:pStyle w:val="ListParagraph"/>
+        <w:numPr>
+          <w:ilvl w:val="0"/>
+          <w:numId w:val="2"/>
+        </w:numPr>
+      </w:pPr>
+      <w:r>
+        <w:t xml:space="preserve">Content stored as structured JSON (ProseMirror document model).</w:t>
+      </w:r>
+    </w:p>
+    <w:p>
+      <w:pPr>
+        <w:pStyle w:val="ListParagraph"/>
+        <w:numPr>
+          <w:ilvl w:val="0"/>
+          <w:numId w:val="2"/>
+        </w:numPr>
+      </w:pPr>
+      <w:r>
+        <w:t xml:space="preserve">Markdown import/export so content can be passed to and from the LLM layer without conversion loss.</w:t>
+      </w:r>
+    </w:p>
+    <w:p>
+      <w:r>
+        <w:t xml:space="preserve"/>
+      </w:r>
+    </w:p>
+    <w:p>
+      <w:pPr>
+        <w:pStyle w:val="Heading2"/>
+      </w:pPr>
+      <w:r>
+        <w:rPr>
+          <w:color w:val="2E75B6"/>
+        </w:rPr>
+        <w:t xml:space="preserve">9.3 Code Syntax Highlighting (Shiki)</w:t>
+      </w:r>
+    </w:p>
+    <w:p>
+      <w:r>
+        <w:t xml:space="preserve">Shiki is used for all code block rendering throughout the UI. It uses the same grammar files as VS Code, so syntax highlighting is accurate and familiar. It runs at render time with no runtime grammar loading, making it suitable for both server-side and client-side use.</w:t>
+      </w:r>
+    </w:p>
+    <w:p>
+      <w:r>
+        <w:t xml:space="preserve"/>
+      </w:r>
+    </w:p>
+    <w:p>
+      <w:pPr>
+        <w:pBdr>
+          <w:bottom w:val="single" w:color="2E75B6" w:sz="6" w:space="1"/>
+        </w:pBdr>
+      </w:pPr>
+      <w:r>
+        <w:t xml:space="preserve"/>
+      </w:r>
+    </w:p>
+    <w:p>
+      <w:pPr>
+        <w:pStyle w:val="Heading1"/>
+      </w:pPr>
+      <w:r>
+        <w:rPr>
+          <w:color w:val="1F4E79"/>
+        </w:rPr>
+        <w:t xml:space="preserve">10. Implementation Roadmap</w:t>
       </w:r>
     </w:p>
     <w:tbl>
@@ -4901,7 +5482,7 @@
         <w:rPr>
           <w:color w:val="1F4E79"/>
         </w:rPr>
-        <w:t xml:space="preserve">10. Security Considerations</w:t>
+        <w:t xml:space="preserve">11. Security Considerations</w:t>
       </w:r>
     </w:p>
     <w:p>
@@ -4987,7 +5568,7 @@
         <w:rPr>
           <w:color w:val="1F4E79"/>
         </w:rPr>
-        <w:t xml:space="preserve">11. Recommended Next Steps</w:t>
+        <w:t xml:space="preserve">12. Recommended Next Steps</w:t>
       </w:r>
     </w:p>
     <w:p>

</xml_diff>

<commit_message>
docs: replace Docker/container references with OSS2 containers
Updated all 5 occurrences across tech stack table, deployment mode
section, web deployment table, folder structure, and roadmap.

Co-Authored-By: Claude Sonnet 4.6 <noreply@anthropic.com>
</commit_message>
<xml_diff>
--- a/AI_Workbench_Architecture.docx
+++ b/AI_Workbench_Architecture.docx
@@ -1528,7 +1528,7 @@
           </w:tcPr>
           <w:p>
             <w:r>
-              <w:t xml:space="preserve">Container (Docker)</w:t>
+              <w:t xml:space="preserve">OSS2 Container</w:t>
             </w:r>
           </w:p>
         </w:tc>
@@ -1551,7 +1551,7 @@
           </w:tcPr>
           <w:p>
             <w:r>
-              <w:t xml:space="preserve">Containerised deployment behind a reverse proxy or cloud service.</w:t>
+              <w:t xml:space="preserve">Deployed as an OSS2 container behind a reverse proxy or cloud service.</w:t>
             </w:r>
           </w:p>
         </w:tc>
@@ -1596,7 +1596,7 @@
     </w:p>
     <w:p>
       <w:r>
-        <w:t xml:space="preserve">The frontend is served as a web application. The backend is deployed as a containerised service. Both communicate over secure REST and WebSocket connections. Users access the app from any browser with no installation required.</w:t>
+        <w:t xml:space="preserve">The frontend is served as a web application. The backend is deployed as an OSS2 container. Both communicate over secure REST and WebSocket connections. Users access the app from any browser with no installation required.</w:t>
       </w:r>
     </w:p>
     <w:p>
@@ -1769,7 +1769,7 @@
           </w:tcPr>
           <w:p>
             <w:r>
-              <w:t xml:space="preserve">Python API server — containerised, cloud or self-hosted</w:t>
+              <w:t xml:space="preserve">Python API server — OSS2 container, cloud or self-hosted</w:t>
             </w:r>
           </w:p>
         </w:tc>
@@ -3269,7 +3269,7 @@
           <w:sz w:val="18"/>
           <w:szCs w:val="18"/>
         </w:rPr>
-        <w:t xml:space="preserve">├── deploy/                     # Container and infrastructure configs</w:t>
+        <w:t xml:space="preserve">├── deploy/                     # OSS2 container and infrastructure configs</w:t>
       </w:r>
     </w:p>
     <w:p>
@@ -5242,7 +5242,7 @@
           </w:tcPr>
           <w:p>
             <w:r>
-              <w:t xml:space="preserve">React frontend, chat UI, Skill launcher, Settings panel, containerised deployment</w:t>
+              <w:t xml:space="preserve">React frontend, chat UI, Skill launcher, Settings panel, OSS2 container deployment</w:t>
             </w:r>
           </w:p>
         </w:tc>

</xml_diff>